<commit_message>
Updated script for opening part
</commit_message>
<xml_diff>
--- a/part04/ISM4545 - Midterm Project - Final Version.docx
+++ b/part04/ISM4545 - Midterm Project - Final Version.docx
@@ -2,24 +2,6 @@
 <file path=word/document.xml><?xml version="1.0" encoding="utf-8"?>
 <w:document xmlns:wpc="http://schemas.microsoft.com/office/word/2010/wordprocessingCanvas" xmlns:cx="http://schemas.microsoft.com/office/drawing/2014/chartex" xmlns:cx1="http://schemas.microsoft.com/office/drawing/2015/9/8/chartex" xmlns:cx2="http://schemas.microsoft.com/office/drawing/2015/10/21/chartex" xmlns:cx3="http://schemas.microsoft.com/office/drawing/2016/5/9/chartex" xmlns:cx4="http://schemas.microsoft.com/office/drawing/2016/5/10/chartex" xmlns:cx5="http://schemas.microsoft.com/office/drawing/2016/5/11/chartex" xmlns:cx6="http://schemas.microsoft.com/office/drawing/2016/5/12/chartex" xmlns:cx7="http://schemas.microsoft.com/office/drawing/2016/5/13/chartex" xmlns:cx8="http://schemas.microsoft.com/office/drawing/2016/5/14/chartex" xmlns:mc="http://schemas.openxmlformats.org/markup-compatibility/2006" xmlns:aink="http://schemas.microsoft.com/office/drawing/2016/ink" xmlns:am3d="http://schemas.microsoft.com/office/drawing/2017/model3d" xmlns:o="urn:schemas-microsoft-com:office:office" xmlns:oel="http://schemas.microsoft.com/office/2019/extlst" xmlns:r="http://schemas.openxmlformats.org/officeDocument/2006/relationships" xmlns:m="http://schemas.openxmlformats.org/officeDocument/2006/math" xmlns:v="urn:schemas-microsoft-com:vml" xmlns:wp14="http://schemas.microsoft.com/office/word/2010/wordprocessingDrawing" xmlns:wp="http://schemas.openxmlformats.org/drawingml/2006/wordprocessingDrawing" xmlns:w10="urn:schemas-microsoft-com:office:word" xmlns:w="http://schemas.openxmlformats.org/wordprocessingml/2006/main" xmlns:w14="http://schemas.microsoft.com/office/word/2010/wordml" xmlns:w15="http://schemas.microsoft.com/office/word/2012/wordml" xmlns:w16cex="http://schemas.microsoft.com/office/word/2018/wordml/cex" xmlns:w16cid="http://schemas.microsoft.com/office/word/2016/wordml/cid" xmlns:w16="http://schemas.microsoft.com/office/word/2018/wordml" xmlns:w16du="http://schemas.microsoft.com/office/word/2023/wordml/word16du" xmlns:w16sdtdh="http://schemas.microsoft.com/office/word/2020/wordml/sdtdatahash" xmlns:w16sdtfl="http://schemas.microsoft.com/office/word/2024/wordml/sdtformatlock" xmlns:w16se="http://schemas.microsoft.com/office/word/2015/wordml/symex" xmlns:wpg="http://schemas.microsoft.com/office/word/2010/wordprocessingGroup" xmlns:wpi="http://schemas.microsoft.com/office/word/2010/wordprocessingInk" xmlns:wne="http://schemas.microsoft.com/office/word/2006/wordml" xmlns:wps="http://schemas.microsoft.com/office/word/2010/wordprocessingShape" mc:Ignorable="w14 w15 w16se w16cid w16 w16cex w16sdtdh w16sdtfl w16du wp14">
   <w:body>
-    <w:p>
-      <w:pPr>
-        <w:pStyle w:val="Heading1"/>
-        <w:rPr>
-          <w:rFonts w:asciiTheme="minorHAnsi" w:hAnsiTheme="minorHAnsi"/>
-          <w:sz w:val="24"/>
-          <w:szCs w:val="24"/>
-        </w:rPr>
-      </w:pPr>
-      <w:r>
-        <w:rPr>
-          <w:rFonts w:asciiTheme="minorHAnsi" w:hAnsiTheme="minorHAnsi"/>
-          <w:sz w:val="24"/>
-          <w:szCs w:val="24"/>
-        </w:rPr>
-        <w:t>Team Introduction (1 min) — Each member states their name and their role in the project (e.g., “Architecture Lead”, “Consistency Analyst”, “Demo/Comparison Lead”, “TechRetail Evaluator”).</w:t>
-      </w:r>
-    </w:p>
     <w:p>
       <w:pPr>
         <w:pStyle w:val="ListParagraph"/>
@@ -29,13 +11,21 @@
         </w:numPr>
       </w:pPr>
       <w:r>
-        <w:t xml:space="preserve">Helen Nguyen: </w:t>
-      </w:r>
-      <w:r>
-        <w:t>Project</w:t>
-      </w:r>
-      <w:r>
-        <w:t xml:space="preserve"> Manager</w:t>
+        <w:t xml:space="preserve">Good evening, we’re a consulting team evaluating whether </w:t>
+      </w:r>
+      <w:hyperlink r:id="rId5" w:history="1">
+        <w:r>
+          <w:t>FoundationDB</w:t>
+        </w:r>
+      </w:hyperlink>
+      <w:r>
+        <w:t xml:space="preserve"> is a strategic fit for TechRetail’s architecture.</w:t>
+      </w:r>
+      <w:r>
+        <w:t xml:space="preserve"> </w:t>
+      </w:r>
+      <w:r>
+        <w:t>Today, TechRetail operates with PostgreSQL shards, Cassandra, and a data warehouse. While each system performs well individually, the combined architecture introduces operational complexity, data duplication, and consistency challenges.</w:t>
       </w:r>
     </w:p>
     <w:p>
@@ -47,24 +37,13 @@
           <w:szCs w:val="24"/>
         </w:rPr>
       </w:pPr>
-      <w:commentRangeStart w:id="0"/>
       <w:r>
         <w:rPr>
           <w:rFonts w:asciiTheme="minorHAnsi" w:hAnsiTheme="minorHAnsi"/>
           <w:sz w:val="24"/>
           <w:szCs w:val="24"/>
         </w:rPr>
-        <w:t>System Overview (2 min) — What the system is, who created it, who uses it in production, and the core value proposition. Set the stage for the technical deep dive.</w:t>
-      </w:r>
-      <w:commentRangeEnd w:id="0"/>
-      <w:r>
-        <w:rPr>
-          <w:rStyle w:val="CommentReference"/>
-          <w:rFonts w:asciiTheme="minorHAnsi" w:hAnsiTheme="minorHAnsi"/>
-          <w:sz w:val="24"/>
-          <w:szCs w:val="24"/>
-        </w:rPr>
-        <w:commentReference w:id="0"/>
+        <w:t>Team Introduction (1 min) — Each member states their name and their role in the project (e.g., “Architecture Lead”, “Consistency Analyst”, “Demo/Comparison Lead”, “TechRetail Evaluator”).</w:t>
       </w:r>
     </w:p>
     <w:p>
@@ -76,13 +55,42 @@
         </w:numPr>
       </w:pPr>
       <w:r>
-        <w:t>FoundationDB is a distributed database</w:t>
-      </w:r>
-      <w:r>
-        <w:t>. I</w:t>
-      </w:r>
-      <w:r>
-        <w:t xml:space="preserve">t spreads data across multiple machines that work together as one system. </w:t>
+        <w:t xml:space="preserve">Helen Nguyen: </w:t>
+      </w:r>
+      <w:r>
+        <w:t>Project</w:t>
+      </w:r>
+      <w:r>
+        <w:t xml:space="preserve"> Manager</w:t>
+      </w:r>
+    </w:p>
+    <w:p>
+      <w:pPr>
+        <w:pStyle w:val="Heading1"/>
+        <w:rPr>
+          <w:rFonts w:asciiTheme="minorHAnsi" w:hAnsiTheme="minorHAnsi"/>
+          <w:sz w:val="24"/>
+          <w:szCs w:val="24"/>
+        </w:rPr>
+      </w:pPr>
+      <w:commentRangeStart w:id="0"/>
+      <w:r>
+        <w:rPr>
+          <w:rFonts w:asciiTheme="minorHAnsi" w:hAnsiTheme="minorHAnsi"/>
+          <w:sz w:val="24"/>
+          <w:szCs w:val="24"/>
+        </w:rPr>
+        <w:t>System Overview (2 min) — What the system is, who created it, who uses it in production, and the core value proposition. Set the stage for the technical deep dive.</w:t>
+      </w:r>
+      <w:commentRangeEnd w:id="0"/>
+      <w:r>
+        <w:rPr>
+          <w:rStyle w:val="CommentReference"/>
+          <w:rFonts w:asciiTheme="minorHAnsi" w:hAnsiTheme="minorHAnsi"/>
+          <w:sz w:val="24"/>
+          <w:szCs w:val="24"/>
+        </w:rPr>
+        <w:commentReference w:id="0"/>
       </w:r>
     </w:p>
     <w:p>
@@ -94,19 +102,13 @@
         </w:numPr>
       </w:pPr>
       <w:r>
-        <w:t xml:space="preserve">FoundationDB stores data as an ordered key-value store. </w:t>
-      </w:r>
-      <w:r>
-        <w:t>E</w:t>
-      </w:r>
-      <w:r>
-        <w:t>ach piece of data has a key, which is like a label, and a value, which is the information stored under that label. The “ordered” part means those keys are kept in sorted order, which helps the system find data efficiently</w:t>
-      </w:r>
-      <w:r>
-        <w:t>.</w:t>
-      </w:r>
-      <w:r>
-        <w:t xml:space="preserve"> </w:t>
+        <w:t>FoundationDB is a distributed database</w:t>
+      </w:r>
+      <w:r>
+        <w:t>. I</w:t>
+      </w:r>
+      <w:r>
+        <w:t xml:space="preserve">t spreads data across multiple machines that work together as one system. </w:t>
       </w:r>
     </w:p>
     <w:p>
@@ -118,11 +120,19 @@
         </w:numPr>
       </w:pPr>
       <w:r>
-        <w:rPr>
-          <w:rFonts w:eastAsia="Times New Roman" w:cs="Times New Roman"/>
-          <w:lang w:eastAsia="en-US"/>
-        </w:rPr>
-        <w:t>FoundationDB was originally created by FoundationDB, Inc. Today, it’s part of the FoundationDB open-source project under Apple’s stewardship.</w:t>
+        <w:t xml:space="preserve">FoundationDB stores data as an ordered key-value store. </w:t>
+      </w:r>
+      <w:r>
+        <w:t>E</w:t>
+      </w:r>
+      <w:r>
+        <w:t>ach piece of data has a key, which is like a label, and a value, which is the information stored under that label. The “ordered” part means those keys are kept in sorted order, which helps the system find data efficiently</w:t>
+      </w:r>
+      <w:r>
+        <w:t>.</w:t>
+      </w:r>
+      <w:r>
+        <w:t xml:space="preserve"> </w:t>
       </w:r>
     </w:p>
     <w:p>
@@ -132,24 +142,13 @@
           <w:ilvl w:val="0"/>
           <w:numId w:val="19"/>
         </w:numPr>
+      </w:pPr>
+      <w:r>
         <w:rPr>
           <w:rFonts w:eastAsia="Times New Roman" w:cs="Times New Roman"/>
           <w:lang w:eastAsia="en-US"/>
         </w:rPr>
-      </w:pPr>
-      <w:r>
-        <w:rPr>
-          <w:rFonts w:eastAsia="Times New Roman" w:cs="Times New Roman"/>
-          <w:lang w:eastAsia="en-US"/>
-        </w:rPr>
-        <w:t xml:space="preserve">Who </w:t>
-      </w:r>
-      <w:r>
-        <w:rPr>
-          <w:rFonts w:eastAsia="Times New Roman" w:cs="Times New Roman"/>
-          <w:lang w:eastAsia="en-US"/>
-        </w:rPr>
-        <w:t xml:space="preserve">uses it in production, FoundationDB is designed for real production environments where a business cannot afford to lose data integrity just because the system is distributed. It is especially useful for applications with heavy read and write workloads. Publicly documented production users of FoundationDB include Snowflake, Wavefront by VMware, and Apple. </w:t>
+        <w:t>FoundationDB was originally created by FoundationDB, Inc. Today, it’s part of the FoundationDB open-source project under Apple’s stewardship.</w:t>
       </w:r>
     </w:p>
     <w:p>
@@ -159,6 +158,33 @@
           <w:ilvl w:val="0"/>
           <w:numId w:val="19"/>
         </w:numPr>
+        <w:rPr>
+          <w:rFonts w:eastAsia="Times New Roman" w:cs="Times New Roman"/>
+          <w:lang w:eastAsia="en-US"/>
+        </w:rPr>
+      </w:pPr>
+      <w:r>
+        <w:rPr>
+          <w:rFonts w:eastAsia="Times New Roman" w:cs="Times New Roman"/>
+          <w:lang w:eastAsia="en-US"/>
+        </w:rPr>
+        <w:t xml:space="preserve">Who </w:t>
+      </w:r>
+      <w:r>
+        <w:rPr>
+          <w:rFonts w:eastAsia="Times New Roman" w:cs="Times New Roman"/>
+          <w:lang w:eastAsia="en-US"/>
+        </w:rPr>
+        <w:t xml:space="preserve">uses it in production, FoundationDB is designed for real production environments where a business cannot afford to lose data integrity just because the system is distributed. It is especially useful for applications with heavy read and write workloads. Publicly documented production users of FoundationDB include Snowflake, Wavefront by VMware, and Apple. </w:t>
+      </w:r>
+    </w:p>
+    <w:p>
+      <w:pPr>
+        <w:pStyle w:val="ListParagraph"/>
+        <w:numPr>
+          <w:ilvl w:val="0"/>
+          <w:numId w:val="19"/>
+        </w:numPr>
       </w:pPr>
       <w:r>
         <w:rPr>
@@ -269,6 +295,7 @@
           <w:rFonts w:eastAsia="Times New Roman" w:cs="Times New Roman"/>
           <w:lang w:eastAsia="en-US"/>
         </w:rPr>
+        <w:lastRenderedPageBreak/>
         <w:t>And fourth, it supports</w:t>
       </w:r>
       <w:r>
@@ -338,7 +365,6 @@
           <w:rFonts w:eastAsia="Times New Roman" w:cs="Times New Roman"/>
           <w:lang w:eastAsia="en-US"/>
         </w:rPr>
-        <w:lastRenderedPageBreak/>
         <w:t>Its architecture reinforces that value by dividing the system into specialized roles, where each role handles a different job. This matters allows different types of work to scale separately</w:t>
       </w:r>
       <w:r>
@@ -757,7 +783,7 @@
                     <pic:cNvPicPr/>
                   </pic:nvPicPr>
                   <pic:blipFill>
-                    <a:blip r:embed="rId9">
+                    <a:blip r:embed="rId10">
                       <a:extLst>
                         <a:ext uri="{28A0092B-C50C-407E-A947-70E740481C1C}">
                           <a14:useLocalDpi xmlns:a14="http://schemas.microsoft.com/office/drawing/2010/main"/>
@@ -789,8 +815,6 @@
     </w:p>
     <w:p/>
     <w:p/>
-    <w:p/>
-    <w:p/>
     <w:p>
       <w:pPr>
         <w:shd w:val="clear" w:color="auto" w:fill="FFFFFF" w:themeFill="background1"/>
@@ -977,7 +1001,6 @@
         <w:rPr>
           <w:rFonts w:eastAsia="Aptos" w:cs="Aptos"/>
         </w:rPr>
-        <w:lastRenderedPageBreak/>
         <w:t>Automatic range-based sharding</w:t>
       </w:r>
     </w:p>
@@ -1016,6 +1039,7 @@
         <w:rPr>
           <w:rFonts w:eastAsia="Aptos" w:cs="Aptos"/>
         </w:rPr>
+        <w:lastRenderedPageBreak/>
         <w:t>Rebalancing is automatic when nodes added/removed</w:t>
       </w:r>
     </w:p>
@@ -1514,7 +1538,6 @@
         <w:rPr>
           <w:rFonts w:eastAsia="Aptos" w:cs="Aptos"/>
         </w:rPr>
-        <w:lastRenderedPageBreak/>
         <w:t xml:space="preserve"> Tradeoff</w:t>
       </w:r>
     </w:p>
@@ -1534,6 +1557,7 @@
         <w:rPr>
           <w:rFonts w:eastAsia="Aptos" w:cs="Aptos"/>
         </w:rPr>
+        <w:lastRenderedPageBreak/>
         <w:t xml:space="preserve"> </w:t>
       </w:r>
       <w:r>

</xml_diff>